<commit_message>
Remove R.A.D Logistics entry; update CVs
</commit_message>
<xml_diff>
--- a/cv/CV_Mahesh_Pentu_EN.docx
+++ b/cv/CV_Mahesh_Pentu_EN.docx
@@ -56,7 +56,7 @@
     </w:p>
     <w:p>
       <w:r>
-        <w:t>Data Analysis graduate (80/100, Universita della Campania "Luigi Vanvitelli", 2026) with 2 years of hands-on experience in data entry supervision, data quality control and logistics coordination. Trilingual (Italian, English, Telugu). Strong Excel user with an eye for data accuracy and reporting. Seeking a first role as Junior Data Analyst, BI support or data-driven operational position; open to internships and fixed-term contracts.</w:t>
+        <w:t>Data Analysis graduate (80/100, Universita della Campania "Luigi Vanvitelli", 2026) with hands-on experience in data entry supervision and data quality control. Trilingual (Italian, English, Telugu). Strong Excel user with an eye for data accuracy and reporting. Seeking a first role as Junior Data Analyst, BI support or data-driven operational position; open to internships and fixed-term contracts.</w:t>
       </w:r>
     </w:p>
     <w:p>
@@ -121,25 +121,6 @@
       </w:pPr>
       <w:r>
         <w:t>Supervised a data entry team; performed data quality control, verification and cleaning of large datasets; prepared status reports; ensured accuracy and consistency of processed information.</w:t>
-      </w:r>
-    </w:p>
-    <w:p>
-      <w:r>
-        <w:rPr>
-          <w:b/>
-        </w:rPr>
-        <w:t>Logistics / Distribution Coordinator — R.A.D Logistics, Milan</w:t>
-      </w:r>
-      <w:r>
-        <w:t xml:space="preserve">  (2021)</w:t>
-      </w:r>
-    </w:p>
-    <w:p>
-      <w:pPr>
-        <w:pStyle w:val="ListBullet"/>
-      </w:pPr>
-      <w:r>
-        <w:t>Coordinated distribution operations; monitored and managed operational data and delivery flows; supported reporting and team coordination in a fast-paced environment.</w:t>
       </w:r>
     </w:p>
     <w:p>

</xml_diff>